<commit_message>
Cotizaciones: la hoja del cliente cabe en una pagina
La cotizacion se recorta a lo que trae el formato original: saludo, los
tres parrafos, la tabla de conceptos y las consideraciones. Salen el
folio, los datos del cliente, la ficha de mercancia y el bloque de
firmas, que eran anadidos mios y no venian en el formato.

Las cifras de la mercancia siguen siendo editables dentro del parrafo. El
valor declarado se mueve al panel interno porque solo alimenta el calculo
del seguro y el cliente no tiene por que verlo.

Co-Authored-By: Claude Opus 5 <noreply@anthropic.com>
Claude-Session: https://claude.ai/code/session_017DE5RtjtLFhQ3FcsP1iHRy
</commit_message>
<xml_diff>
--- a/plantillas/cotizador/salida/EJEMPLO_1_COTIZACION_FLETES_TAURO.docx
+++ b/plantillas/cotizador/salida/EJEMPLO_1_COTIZACION_FLETES_TAURO.docx
@@ -2,8 +2,8 @@
 <file path=word/document.xml><?xml version="1.0" encoding="utf-8"?>
 <w:document xmlns:wpc="http://schemas.microsoft.com/office/word/2010/wordprocessingCanvas" xmlns:mc="http://schemas.openxmlformats.org/markup-compatibility/2006" xmlns:o="urn:schemas-microsoft-com:office:office" xmlns:r="http://schemas.openxmlformats.org/officeDocument/2006/relationships" xmlns:m="http://schemas.openxmlformats.org/officeDocument/2006/math" xmlns:v="urn:schemas-microsoft-com:vml" xmlns:wp14="http://schemas.microsoft.com/office/word/2010/wordprocessingDrawing" xmlns:wp="http://schemas.openxmlformats.org/drawingml/2006/wordprocessingDrawing" xmlns:w10="urn:schemas-microsoft-com:office:word" xmlns:w="http://schemas.openxmlformats.org/wordprocessingml/2006/main" xmlns:w14="http://schemas.microsoft.com/office/word/2010/wordml" xmlns:w15="http://schemas.microsoft.com/office/word/2012/wordml" xmlns:wpg="http://schemas.microsoft.com/office/word/2010/wordprocessingGroup" xmlns:wpi="http://schemas.microsoft.com/office/word/2010/wordprocessingInk" xmlns:wne="http://schemas.microsoft.com/office/word/2006/wordml" xmlns:wps="http://schemas.microsoft.com/office/word/2010/wordprocessingShape" mc:Ignorable="w14 w15 wp14">
   <w:body>
-    <w:bookmarkStart w:id="1131" w:name="COTIZACION"/>
-    <w:bookmarkEnd w:id="1131"/>
+    <w:bookmarkStart w:id="1097" w:name="COTIZACION"/>
+    <w:bookmarkEnd w:id="1097"/>
     <w:tbl>
       <w:tblPr>
         <w:tblW w:w="10080" w:type="dxa"/>
@@ -17,22 +17,21 @@
         <w:tblLook w:val="0000" w:firstRow="0" w:lastRow="0" w:firstColumn="0" w:lastColumn="0" w:noHBand="1" w:noVBand="1"/>
       </w:tblPr>
       <w:tblGrid>
-        <w:gridCol w:w="5600"/>
-        <w:gridCol w:w="4480"/>
+        <w:gridCol w:w="10080"/>
       </w:tblGrid>
       <w:tr>
         <w:trPr>
           <w:cantSplit/>
-          <w:trHeight w:val="1000" w:hRule="atLeast"/>
+          <w:trHeight w:val="760" w:hRule="atLeast"/>
         </w:trPr>
         <w:tc>
           <w:tcPr>
-            <w:tcW w:w="5600" w:type="dxa"/>
+            <w:tcW w:w="10080" w:type="dxa"/>
             <w:shd w:val="clear" w:color="auto" w:fill="0F2B46"/>
             <w:tcMar>
-              <w:top w:w="220" w:type="dxa"/>
+              <w:top w:w="170" w:type="dxa"/>
               <w:left w:w="300" w:type="dxa"/>
-              <w:bottom w:w="220" w:type="dxa"/>
+              <w:bottom w:w="170" w:type="dxa"/>
               <w:right w:w="300" w:type="dxa"/>
             </w:tcMar>
             <w:vAlign w:val="center"/>
@@ -46,55 +45,10 @@
                 <w:rFonts w:ascii="Segoe UI Light" w:hAnsi="Segoe UI Light" w:cs="Segoe UI Light"/>
                 <w:color w:val="FFFFFF"/>
                 <w:spacing w:val="120"/>
-                <w:sz w:val="44"/>
-                <w:szCs w:val="44"/>
+                <w:sz w:val="40"/>
+                <w:szCs w:val="40"/>
               </w:rPr>
               <w:t xml:space="preserve">COTIZACIÓN</w:t>
-            </w:r>
-          </w:p>
-        </w:tc>
-        <w:tc>
-          <w:tcPr>
-            <w:tcW w:w="4480" w:type="dxa"/>
-            <w:shd w:val="clear" w:color="auto" w:fill="0F2B46"/>
-            <w:tcMar>
-              <w:top w:w="220" w:type="dxa"/>
-              <w:left w:w="300" w:type="dxa"/>
-              <w:bottom w:w="220" w:type="dxa"/>
-              <w:right w:w="300" w:type="dxa"/>
-            </w:tcMar>
-            <w:vAlign w:val="center"/>
-          </w:tcPr>
-          <w:p>
-            <w:pPr>
-              <w:spacing w:before="0" w:after="20"/>
-              <w:jc w:val="right"/>
-            </w:pPr>
-            <w:r>
-              <w:rPr>
-                <w:rFonts w:ascii="Segoe UI" w:hAnsi="Segoe UI" w:cs="Segoe UI"/>
-                <w:caps/>
-                <w:color w:val="A9BDD1"/>
-                <w:spacing w:val="60"/>
-                <w:sz w:val="16"/>
-                <w:szCs w:val="16"/>
-              </w:rPr>
-              <w:t xml:space="preserve">Propuesta económica</w:t>
-            </w:r>
-          </w:p>
-          <w:p>
-            <w:pPr>
-              <w:spacing w:before="0" w:after="0"/>
-              <w:jc w:val="right"/>
-            </w:pPr>
-            <w:r>
-              <w:rPr>
-                <w:rFonts w:ascii="Segoe UI" w:hAnsi="Segoe UI" w:cs="Segoe UI"/>
-                <w:color w:val="8FA6BE"/>
-                <w:sz w:val="15"/>
-                <w:szCs w:val="15"/>
-              </w:rPr>
-              <w:t xml:space="preserve">Servicios de transporte terrestre de carga</w:t>
             </w:r>
           </w:p>
         </w:tc>
@@ -113,505 +67,6 @@
         </w:rPr>
       </w:r>
     </w:p>
-    <w:tbl>
-      <w:tblPr>
-        <w:tblW w:w="10080" w:type="dxa"/>
-        <w:tblLayout w:type="fixed"/>
-        <w:tblCellMar>
-          <w:top w:w="60" w:type="dxa"/>
-          <w:left w:w="100" w:type="dxa"/>
-          <w:bottom w:w="60" w:type="dxa"/>
-          <w:right w:w="100" w:type="dxa"/>
-        </w:tblCellMar>
-        <w:tblLook w:val="0000" w:firstRow="0" w:lastRow="0" w:firstColumn="0" w:lastColumn="0" w:noHBand="1" w:noVBand="1"/>
-      </w:tblPr>
-      <w:tblGrid>
-        <w:gridCol w:w="2100"/>
-        <w:gridCol w:w="2960"/>
-        <w:gridCol w:w="2320"/>
-        <w:gridCol w:w="2700"/>
-      </w:tblGrid>
-      <w:tr>
-        <w:trPr>
-          <w:cantSplit/>
-          <w:trHeight w:val="760" w:hRule="atLeast"/>
-        </w:trPr>
-        <w:tc>
-          <w:tcPr>
-            <w:tcW w:w="2100" w:type="dxa"/>
-            <w:tcBorders>
-              <w:bottom w:val="single" w:sz="4" w:space="0" w:color="D8DBE0"/>
-              <w:right w:val="single" w:sz="4" w:space="0" w:color="D8DBE0"/>
-            </w:tcBorders>
-            <w:shd w:val="clear" w:color="auto" w:fill="F5F6F8"/>
-            <w:tcMar>
-              <w:top w:w="150" w:type="dxa"/>
-              <w:left w:w="200" w:type="dxa"/>
-              <w:bottom w:w="150" w:type="dxa"/>
-              <w:right w:w="200" w:type="dxa"/>
-            </w:tcMar>
-            <w:vAlign w:val="top"/>
-          </w:tcPr>
-          <w:p>
-            <w:pPr>
-              <w:spacing w:before="0" w:after="30"/>
-            </w:pPr>
-            <w:r>
-              <w:rPr>
-                <w:rFonts w:ascii="Segoe UI" w:hAnsi="Segoe UI" w:cs="Segoe UI"/>
-                <w:caps/>
-                <w:color w:val="9A9A94"/>
-                <w:spacing w:val="50"/>
-                <w:sz w:val="14"/>
-                <w:szCs w:val="14"/>
-              </w:rPr>
-              <w:t xml:space="preserve">Folio</w:t>
-            </w:r>
-          </w:p>
-          <w:p>
-            <w:pPr>
-              <w:spacing w:before="0" w:after="0"/>
-            </w:pPr>
-            <w:r>
-              <w:rPr>
-                <w:rFonts w:ascii="Segoe UI Semibold" w:hAnsi="Segoe UI Semibold" w:cs="Segoe UI Semibold"/>
-                <w:b/>
-                <w:bCs/>
-                <w:color w:val="0F2B46"/>
-                <w:sz w:val="20"/>
-                <w:szCs w:val="20"/>
-              </w:rPr>
-              <w:t xml:space="preserve">FT-2026-0114</w:t>
-            </w:r>
-          </w:p>
-        </w:tc>
-        <w:tc>
-          <w:tcPr>
-            <w:tcW w:w="2960" w:type="dxa"/>
-            <w:tcBorders>
-              <w:bottom w:val="single" w:sz="4" w:space="0" w:color="D8DBE0"/>
-              <w:right w:val="single" w:sz="4" w:space="0" w:color="D8DBE0"/>
-            </w:tcBorders>
-            <w:shd w:val="clear" w:color="auto" w:fill="F5F6F8"/>
-            <w:tcMar>
-              <w:top w:w="150" w:type="dxa"/>
-              <w:left w:w="200" w:type="dxa"/>
-              <w:bottom w:w="150" w:type="dxa"/>
-              <w:right w:w="200" w:type="dxa"/>
-            </w:tcMar>
-            <w:vAlign w:val="top"/>
-          </w:tcPr>
-          <w:p>
-            <w:pPr>
-              <w:spacing w:before="0" w:after="30"/>
-            </w:pPr>
-            <w:r>
-              <w:rPr>
-                <w:rFonts w:ascii="Segoe UI" w:hAnsi="Segoe UI" w:cs="Segoe UI"/>
-                <w:caps/>
-                <w:color w:val="9A9A94"/>
-                <w:spacing w:val="50"/>
-                <w:sz w:val="14"/>
-                <w:szCs w:val="14"/>
-              </w:rPr>
-              <w:t xml:space="preserve">Fecha de emisión</w:t>
-            </w:r>
-          </w:p>
-          <w:p>
-            <w:pPr>
-              <w:spacing w:before="0" w:after="0"/>
-            </w:pPr>
-            <w:r>
-              <w:rPr>
-                <w:rFonts w:ascii="Segoe UI Semibold" w:hAnsi="Segoe UI Semibold" w:cs="Segoe UI Semibold"/>
-                <w:b/>
-                <w:bCs/>
-                <w:color w:val="0F2B46"/>
-                <w:sz w:val="20"/>
-                <w:szCs w:val="20"/>
-              </w:rPr>
-              <w:t xml:space="preserve">10 de agosto de 2026</w:t>
-            </w:r>
-          </w:p>
-        </w:tc>
-        <w:tc>
-          <w:tcPr>
-            <w:tcW w:w="2320" w:type="dxa"/>
-            <w:tcBorders>
-              <w:bottom w:val="single" w:sz="4" w:space="0" w:color="D8DBE0"/>
-              <w:right w:val="single" w:sz="4" w:space="0" w:color="D8DBE0"/>
-            </w:tcBorders>
-            <w:shd w:val="clear" w:color="auto" w:fill="F5F6F8"/>
-            <w:tcMar>
-              <w:top w:w="150" w:type="dxa"/>
-              <w:left w:w="200" w:type="dxa"/>
-              <w:bottom w:w="150" w:type="dxa"/>
-              <w:right w:w="200" w:type="dxa"/>
-            </w:tcMar>
-            <w:vAlign w:val="top"/>
-          </w:tcPr>
-          <w:p>
-            <w:pPr>
-              <w:spacing w:before="0" w:after="30"/>
-            </w:pPr>
-            <w:r>
-              <w:rPr>
-                <w:rFonts w:ascii="Segoe UI" w:hAnsi="Segoe UI" w:cs="Segoe UI"/>
-                <w:caps/>
-                <w:color w:val="9A9A94"/>
-                <w:spacing w:val="50"/>
-                <w:sz w:val="14"/>
-                <w:szCs w:val="14"/>
-              </w:rPr>
-              <w:t xml:space="preserve">Vigencia</w:t>
-            </w:r>
-          </w:p>
-          <w:p>
-            <w:pPr>
-              <w:spacing w:before="0" w:after="0"/>
-            </w:pPr>
-            <w:r>
-              <w:rPr>
-                <w:rFonts w:ascii="Segoe UI Semibold" w:hAnsi="Segoe UI Semibold" w:cs="Segoe UI Semibold"/>
-                <w:b/>
-                <w:bCs/>
-                <w:color w:val="0F2B46"/>
-                <w:sz w:val="20"/>
-                <w:szCs w:val="20"/>
-              </w:rPr>
-              <w:t xml:space="preserve">15 días naturales</w:t>
-            </w:r>
-          </w:p>
-        </w:tc>
-        <w:tc>
-          <w:tcPr>
-            <w:tcW w:w="2700" w:type="dxa"/>
-            <w:tcBorders>
-              <w:bottom w:val="single" w:sz="4" w:space="0" w:color="D8DBE0"/>
-            </w:tcBorders>
-            <w:shd w:val="clear" w:color="auto" w:fill="F5F6F8"/>
-            <w:tcMar>
-              <w:top w:w="150" w:type="dxa"/>
-              <w:left w:w="200" w:type="dxa"/>
-              <w:bottom w:w="150" w:type="dxa"/>
-              <w:right w:w="200" w:type="dxa"/>
-            </w:tcMar>
-            <w:vAlign w:val="top"/>
-          </w:tcPr>
-          <w:p>
-            <w:pPr>
-              <w:spacing w:before="0" w:after="30"/>
-            </w:pPr>
-            <w:r>
-              <w:rPr>
-                <w:rFonts w:ascii="Segoe UI" w:hAnsi="Segoe UI" w:cs="Segoe UI"/>
-                <w:caps/>
-                <w:color w:val="9A9A94"/>
-                <w:spacing w:val="50"/>
-                <w:sz w:val="14"/>
-                <w:szCs w:val="14"/>
-              </w:rPr>
-              <w:t xml:space="preserve">Ejecutivo</w:t>
-            </w:r>
-          </w:p>
-          <w:p>
-            <w:pPr>
-              <w:spacing w:before="0" w:after="0"/>
-            </w:pPr>
-            <w:r>
-              <w:rPr>
-                <w:rFonts w:ascii="Segoe UI Semibold" w:hAnsi="Segoe UI Semibold" w:cs="Segoe UI Semibold"/>
-                <w:b/>
-                <w:bCs/>
-                <w:color w:val="0F2B46"/>
-                <w:sz w:val="20"/>
-                <w:szCs w:val="20"/>
-              </w:rPr>
-              <w:t xml:space="preserve">Carlos Treviño</w:t>
-            </w:r>
-          </w:p>
-        </w:tc>
-      </w:tr>
-    </w:tbl>
-    <w:p>
-      <w:pPr>
-        <w:keepNext/>
-        <w:pBdr>
-          <w:left w:val="single" w:sz="16" w:space="7" w:color="B4975A"/>
-          <w:bottom w:val="single" w:sz="4" w:space="7" w:color="D8DBE0"/>
-        </w:pBdr>
-        <w:spacing w:before="340" w:after="160"/>
-        <w:ind w:left="190"/>
-      </w:pPr>
-      <w:r>
-        <w:rPr>
-          <w:rFonts w:ascii="Segoe UI Semibold" w:hAnsi="Segoe UI Semibold" w:cs="Segoe UI Semibold"/>
-          <w:b/>
-          <w:bCs/>
-          <w:caps/>
-          <w:color w:val="0F2B46"/>
-          <w:spacing w:val="60"/>
-          <w:sz w:val="17"/>
-          <w:szCs w:val="17"/>
-        </w:rPr>
-        <w:t xml:space="preserve">Datos del cliente</w:t>
-      </w:r>
-    </w:p>
-    <w:tbl>
-      <w:tblPr>
-        <w:tblW w:w="10080" w:type="dxa"/>
-        <w:tblLayout w:type="fixed"/>
-        <w:tblCellMar>
-          <w:top w:w="60" w:type="dxa"/>
-          <w:left w:w="100" w:type="dxa"/>
-          <w:bottom w:w="60" w:type="dxa"/>
-          <w:right w:w="100" w:type="dxa"/>
-        </w:tblCellMar>
-        <w:tblLook w:val="0000" w:firstRow="0" w:lastRow="0" w:firstColumn="0" w:lastColumn="0" w:noHBand="1" w:noVBand="1"/>
-      </w:tblPr>
-      <w:tblGrid>
-        <w:gridCol w:w="5040"/>
-        <w:gridCol w:w="5040"/>
-      </w:tblGrid>
-      <w:tr>
-        <w:trPr>
-          <w:cantSplit/>
-          <w:trHeight w:val="640" w:hRule="atLeast"/>
-        </w:trPr>
-        <w:tc>
-          <w:tcPr>
-            <w:tcW w:w="5040" w:type="dxa"/>
-            <w:tcBorders>
-              <w:bottom w:val="single" w:sz="4" w:space="0" w:color="EBEDF0"/>
-              <w:right w:val="single" w:sz="4" w:space="0" w:color="EBEDF0"/>
-            </w:tcBorders>
-            <w:tcMar>
-              <w:top w:w="150" w:type="dxa"/>
-              <w:left w:w="0" w:type="dxa"/>
-              <w:bottom w:w="150" w:type="dxa"/>
-              <w:right w:w="200" w:type="dxa"/>
-            </w:tcMar>
-            <w:vAlign w:val="top"/>
-          </w:tcPr>
-          <w:p>
-            <w:pPr>
-              <w:spacing w:before="0" w:after="30"/>
-            </w:pPr>
-            <w:r>
-              <w:rPr>
-                <w:rFonts w:ascii="Segoe UI" w:hAnsi="Segoe UI" w:cs="Segoe UI"/>
-                <w:caps/>
-                <w:color w:val="9A9A94"/>
-                <w:spacing w:val="50"/>
-                <w:sz w:val="14"/>
-                <w:szCs w:val="14"/>
-              </w:rPr>
-              <w:t xml:space="preserve">Empresa</w:t>
-            </w:r>
-          </w:p>
-          <w:p>
-            <w:pPr>
-              <w:spacing w:before="0" w:after="0"/>
-            </w:pPr>
-            <w:r>
-              <w:rPr>
-                <w:rFonts w:ascii="Segoe UI Semibold" w:hAnsi="Segoe UI Semibold" w:cs="Segoe UI Semibold"/>
-                <w:b/>
-                <w:bCs/>
-                <w:color w:val="0F2B46"/>
-                <w:sz w:val="20"/>
-                <w:szCs w:val="20"/>
-              </w:rPr>
-              <w:t xml:space="preserve">Industrias del Norte, S.A. de C.V.</w:t>
-            </w:r>
-          </w:p>
-        </w:tc>
-        <w:tc>
-          <w:tcPr>
-            <w:tcW w:w="5040" w:type="dxa"/>
-            <w:tcBorders>
-              <w:bottom w:val="single" w:sz="4" w:space="0" w:color="EBEDF0"/>
-            </w:tcBorders>
-            <w:tcMar>
-              <w:top w:w="150" w:type="dxa"/>
-              <w:left w:w="200" w:type="dxa"/>
-              <w:bottom w:w="150" w:type="dxa"/>
-              <w:right w:w="0" w:type="dxa"/>
-            </w:tcMar>
-            <w:vAlign w:val="top"/>
-          </w:tcPr>
-          <w:p>
-            <w:pPr>
-              <w:spacing w:before="0" w:after="30"/>
-            </w:pPr>
-            <w:r>
-              <w:rPr>
-                <w:rFonts w:ascii="Segoe UI" w:hAnsi="Segoe UI" w:cs="Segoe UI"/>
-                <w:caps/>
-                <w:color w:val="9A9A94"/>
-                <w:spacing w:val="50"/>
-                <w:sz w:val="14"/>
-                <w:szCs w:val="14"/>
-              </w:rPr>
-              <w:t xml:space="preserve">Atención</w:t>
-            </w:r>
-          </w:p>
-          <w:p>
-            <w:pPr>
-              <w:spacing w:before="0" w:after="0"/>
-            </w:pPr>
-            <w:r>
-              <w:rPr>
-                <w:rFonts w:ascii="Segoe UI Semibold" w:hAnsi="Segoe UI Semibold" w:cs="Segoe UI Semibold"/>
-                <w:b/>
-                <w:bCs/>
-                <w:color w:val="0F2B46"/>
-                <w:sz w:val="20"/>
-                <w:szCs w:val="20"/>
-              </w:rPr>
-              <w:t xml:space="preserve">Ing. Laura Medina</w:t>
-            </w:r>
-          </w:p>
-        </w:tc>
-      </w:tr>
-      <w:tr>
-        <w:trPr>
-          <w:cantSplit/>
-          <w:trHeight w:val="640" w:hRule="atLeast"/>
-        </w:trPr>
-        <w:tc>
-          <w:tcPr>
-            <w:tcW w:w="5040" w:type="dxa"/>
-            <w:tcBorders>
-              <w:right w:val="single" w:sz="4" w:space="0" w:color="EBEDF0"/>
-            </w:tcBorders>
-            <w:tcMar>
-              <w:top w:w="150" w:type="dxa"/>
-              <w:left w:w="0" w:type="dxa"/>
-              <w:bottom w:w="60" w:type="dxa"/>
-              <w:right w:w="200" w:type="dxa"/>
-            </w:tcMar>
-            <w:vAlign w:val="top"/>
-          </w:tcPr>
-          <w:p>
-            <w:pPr>
-              <w:spacing w:before="0" w:after="30"/>
-            </w:pPr>
-            <w:r>
-              <w:rPr>
-                <w:rFonts w:ascii="Segoe UI" w:hAnsi="Segoe UI" w:cs="Segoe UI"/>
-                <w:caps/>
-                <w:color w:val="9A9A94"/>
-                <w:spacing w:val="50"/>
-                <w:sz w:val="14"/>
-                <w:szCs w:val="14"/>
-              </w:rPr>
-              <w:t xml:space="preserve">Contacto</w:t>
-            </w:r>
-          </w:p>
-          <w:p>
-            <w:pPr>
-              <w:spacing w:before="0" w:after="0"/>
-            </w:pPr>
-            <w:r>
-              <w:rPr>
-                <w:rFonts w:ascii="Segoe UI" w:hAnsi="Segoe UI" w:cs="Segoe UI"/>
-                <w:color w:val="33383D"/>
-                <w:sz w:val="19"/>
-                <w:szCs w:val="19"/>
-              </w:rPr>
-              <w:t xml:space="preserve">compras@industriasdelnorte.mx · (81) 8123-4500</w:t>
-            </w:r>
-          </w:p>
-        </w:tc>
-        <w:tc>
-          <w:tcPr>
-            <w:tcW w:w="5040" w:type="dxa"/>
-            <w:tcMar>
-              <w:top w:w="150" w:type="dxa"/>
-              <w:left w:w="200" w:type="dxa"/>
-              <w:bottom w:w="60" w:type="dxa"/>
-              <w:right w:w="0" w:type="dxa"/>
-            </w:tcMar>
-            <w:vAlign w:val="top"/>
-          </w:tcPr>
-          <w:p>
-            <w:pPr>
-              <w:spacing w:before="0" w:after="30"/>
-            </w:pPr>
-            <w:r>
-              <w:rPr>
-                <w:rFonts w:ascii="Segoe UI" w:hAnsi="Segoe UI" w:cs="Segoe UI"/>
-                <w:caps/>
-                <w:color w:val="9A9A94"/>
-                <w:spacing w:val="50"/>
-                <w:sz w:val="14"/>
-                <w:szCs w:val="14"/>
-              </w:rPr>
-              <w:t xml:space="preserve">Origen / Destino</w:t>
-            </w:r>
-          </w:p>
-          <w:p>
-            <w:pPr>
-              <w:spacing w:before="0" w:after="0"/>
-            </w:pPr>
-            <w:r>
-              <w:rPr>
-                <w:rFonts w:ascii="Segoe UI" w:hAnsi="Segoe UI" w:cs="Segoe UI"/>
-                <w:color w:val="33383D"/>
-                <w:sz w:val="19"/>
-                <w:szCs w:val="19"/>
-              </w:rPr>
-              <w:t xml:space="preserve">Monterrey, N.L.</w:t>
-            </w:r>
-            <w:r>
-              <w:rPr>
-                <w:rFonts w:ascii="Segoe UI" w:hAnsi="Segoe UI" w:cs="Segoe UI"/>
-                <w:b/>
-                <w:bCs/>
-                <w:color w:val="B4975A"/>
-                <w:sz w:val="19"/>
-                <w:szCs w:val="19"/>
-              </w:rPr>
-              <w:t xml:space="preserve">   →   </w:t>
-            </w:r>
-            <w:r>
-              <w:rPr>
-                <w:rFonts w:ascii="Segoe UI" w:hAnsi="Segoe UI" w:cs="Segoe UI"/>
-                <w:color w:val="33383D"/>
-                <w:sz w:val="19"/>
-                <w:szCs w:val="19"/>
-              </w:rPr>
-              <w:t xml:space="preserve">Ciudad de México</w:t>
-            </w:r>
-          </w:p>
-        </w:tc>
-      </w:tr>
-    </w:tbl>
-    <w:p>
-      <w:pPr>
-        <w:keepNext/>
-        <w:pBdr>
-          <w:left w:val="single" w:sz="16" w:space="7" w:color="B4975A"/>
-          <w:bottom w:val="single" w:sz="4" w:space="7" w:color="D8DBE0"/>
-        </w:pBdr>
-        <w:spacing w:before="340" w:after="160"/>
-        <w:ind w:left="190"/>
-      </w:pPr>
-      <w:r>
-        <w:rPr>
-          <w:rFonts w:ascii="Segoe UI Semibold" w:hAnsi="Segoe UI Semibold" w:cs="Segoe UI Semibold"/>
-          <w:b/>
-          <w:bCs/>
-          <w:caps/>
-          <w:color w:val="0F2B46"/>
-          <w:spacing w:val="60"/>
-          <w:sz w:val="17"/>
-          <w:szCs w:val="17"/>
-        </w:rPr>
-        <w:t xml:space="preserve">Descripción del servicio</w:t>
-      </w:r>
-    </w:p>
     <w:p>
       <w:pPr>
         <w:spacing w:before="0" w:after="140"/>
@@ -630,7 +85,7 @@
     </w:p>
     <w:p>
       <w:pPr>
-        <w:spacing w:before="0" w:after="130" w:line="268" w:lineRule="auto"/>
+        <w:spacing w:before="0" w:after="120" w:line="258" w:lineRule="auto"/>
       </w:pPr>
       <w:r>
         <w:rPr>
@@ -644,7 +99,7 @@
     </w:p>
     <w:p>
       <w:pPr>
-        <w:spacing w:before="0" w:after="130" w:line="268" w:lineRule="auto"/>
+        <w:spacing w:before="0" w:after="120" w:line="258" w:lineRule="auto"/>
         <w:jc w:val="both"/>
       </w:pPr>
       <w:r>
@@ -759,7 +214,7 @@
     </w:p>
     <w:p>
       <w:pPr>
-        <w:spacing w:before="0" w:after="0" w:line="268" w:lineRule="auto"/>
+        <w:spacing w:before="0" w:after="0" w:line="258" w:lineRule="auto"/>
         <w:jc w:val="both"/>
       </w:pPr>
       <w:r>
@@ -779,423 +234,7 @@
           <w:left w:val="single" w:sz="16" w:space="7" w:color="B4975A"/>
           <w:bottom w:val="single" w:sz="4" w:space="7" w:color="D8DBE0"/>
         </w:pBdr>
-        <w:spacing w:before="340" w:after="160"/>
-        <w:ind w:left="190"/>
-      </w:pPr>
-      <w:r>
-        <w:rPr>
-          <w:rFonts w:ascii="Segoe UI Semibold" w:hAnsi="Segoe UI Semibold" w:cs="Segoe UI Semibold"/>
-          <w:b/>
-          <w:bCs/>
-          <w:caps/>
-          <w:color w:val="0F2B46"/>
-          <w:spacing w:val="60"/>
-          <w:sz w:val="17"/>
-          <w:szCs w:val="17"/>
-        </w:rPr>
-        <w:t xml:space="preserve">Detalles de la mercancía</w:t>
-      </w:r>
-    </w:p>
-    <w:tbl>
-      <w:tblPr>
-        <w:tblW w:w="10080" w:type="dxa"/>
-        <w:tblLayout w:type="fixed"/>
-        <w:tblCellMar>
-          <w:top w:w="60" w:type="dxa"/>
-          <w:left w:w="100" w:type="dxa"/>
-          <w:bottom w:w="60" w:type="dxa"/>
-          <w:right w:w="100" w:type="dxa"/>
-        </w:tblCellMar>
-        <w:tblLook w:val="0000" w:firstRow="0" w:lastRow="0" w:firstColumn="0" w:lastColumn="0" w:noHBand="1" w:noVBand="1"/>
-      </w:tblPr>
-      <w:tblGrid>
-        <w:gridCol w:w="2180"/>
-        <w:gridCol w:w="2960"/>
-        <w:gridCol w:w="2280"/>
-        <w:gridCol w:w="2660"/>
-      </w:tblGrid>
-      <w:tr>
-        <w:trPr>
-          <w:cantSplit/>
-          <w:trHeight w:val="680" w:hRule="atLeast"/>
-        </w:trPr>
-        <w:tc>
-          <w:tcPr>
-            <w:tcW w:w="7420" w:type="dxa"/>
-            <w:tcBorders>
-              <w:top w:val="single" w:sz="8" w:space="0" w:color="0F2B46"/>
-              <w:bottom w:val="single" w:sz="4" w:space="0" w:color="D8DBE0"/>
-              <w:right w:val="single" w:sz="4" w:space="0" w:color="D8DBE0"/>
-            </w:tcBorders>
-            <w:shd w:val="clear" w:color="auto" w:fill="F5F6F8"/>
-            <w:tcMar>
-              <w:top w:w="150" w:type="dxa"/>
-              <w:left w:w="200" w:type="dxa"/>
-              <w:bottom w:w="150" w:type="dxa"/>
-              <w:right w:w="200" w:type="dxa"/>
-            </w:tcMar>
-            <w:vAlign w:val="top"/>
-          </w:tcPr>
-          <w:p>
-            <w:pPr>
-              <w:keepNext/>
-              <w:spacing w:before="0" w:after="30"/>
-            </w:pPr>
-            <w:r>
-              <w:rPr>
-                <w:rFonts w:ascii="Segoe UI" w:hAnsi="Segoe UI" w:cs="Segoe UI"/>
-                <w:caps/>
-                <w:color w:val="9A9A94"/>
-                <w:spacing w:val="50"/>
-                <w:sz w:val="14"/>
-                <w:szCs w:val="14"/>
-              </w:rPr>
-              <w:t xml:space="preserve">Descripción de la mercancía</w:t>
-            </w:r>
-          </w:p>
-          <w:p>
-            <w:pPr>
-              <w:keepNext/>
-              <w:spacing w:before="0" w:after="0"/>
-            </w:pPr>
-            <w:r>
-              <w:rPr>
-                <w:rFonts w:ascii="Segoe UI" w:hAnsi="Segoe UI" w:cs="Segoe UI"/>
-                <w:color w:val="33383D"/>
-                <w:sz w:val="19"/>
-                <w:szCs w:val="19"/>
-              </w:rPr>
-              <w:t xml:space="preserve">Refacciones metálicas paletizadas</w:t>
-            </w:r>
-          </w:p>
-        </w:tc>
-        <w:tc>
-          <w:tcPr>
-            <w:tcW w:w="2660" w:type="dxa"/>
-            <w:tcBorders>
-              <w:top w:val="single" w:sz="8" w:space="0" w:color="0F2B46"/>
-              <w:bottom w:val="single" w:sz="4" w:space="0" w:color="D8DBE0"/>
-            </w:tcBorders>
-            <w:shd w:val="clear" w:color="auto" w:fill="F5F6F8"/>
-            <w:tcMar>
-              <w:top w:w="150" w:type="dxa"/>
-              <w:left w:w="200" w:type="dxa"/>
-              <w:bottom w:w="150" w:type="dxa"/>
-              <w:right w:w="200" w:type="dxa"/>
-            </w:tcMar>
-            <w:vAlign w:val="top"/>
-          </w:tcPr>
-          <w:p>
-            <w:pPr>
-              <w:keepNext/>
-              <w:spacing w:before="0" w:after="30"/>
-            </w:pPr>
-            <w:r>
-              <w:rPr>
-                <w:rFonts w:ascii="Segoe UI" w:hAnsi="Segoe UI" w:cs="Segoe UI"/>
-                <w:caps/>
-                <w:color w:val="9A9A94"/>
-                <w:spacing w:val="50"/>
-                <w:sz w:val="14"/>
-                <w:szCs w:val="14"/>
-              </w:rPr>
-              <w:t xml:space="preserve">Tipo de unidad</w:t>
-            </w:r>
-          </w:p>
-          <w:p>
-            <w:pPr>
-              <w:keepNext/>
-              <w:spacing w:before="0" w:after="0"/>
-            </w:pPr>
-            <w:r>
-              <w:rPr>
-                <w:rFonts w:ascii="Segoe UI" w:hAnsi="Segoe UI" w:cs="Segoe UI"/>
-                <w:color w:val="33383D"/>
-                <w:sz w:val="19"/>
-                <w:szCs w:val="19"/>
-              </w:rPr>
-              <w:t xml:space="preserve">Según disponibilidad operativa</w:t>
-            </w:r>
-          </w:p>
-        </w:tc>
-      </w:tr>
-      <w:tr>
-        <w:trPr>
-          <w:cantSplit/>
-          <w:trHeight w:val="680" w:hRule="atLeast"/>
-        </w:trPr>
-        <w:tc>
-          <w:tcPr>
-            <w:tcW w:w="2180" w:type="dxa"/>
-            <w:tcBorders>
-              <w:bottom w:val="single" w:sz="8" w:space="0" w:color="0F2B46"/>
-              <w:right w:val="single" w:sz="4" w:space="0" w:color="D8DBE0"/>
-            </w:tcBorders>
-            <w:shd w:val="clear" w:color="auto" w:fill="F5F6F8"/>
-            <w:tcMar>
-              <w:top w:w="150" w:type="dxa"/>
-              <w:left w:w="200" w:type="dxa"/>
-              <w:bottom w:w="150" w:type="dxa"/>
-              <w:right w:w="200" w:type="dxa"/>
-            </w:tcMar>
-            <w:vAlign w:val="top"/>
-          </w:tcPr>
-          <w:p>
-            <w:pPr>
-              <w:spacing w:before="0" w:after="30"/>
-            </w:pPr>
-            <w:r>
-              <w:rPr>
-                <w:rFonts w:ascii="Segoe UI" w:hAnsi="Segoe UI" w:cs="Segoe UI"/>
-                <w:caps/>
-                <w:color w:val="9A9A94"/>
-                <w:spacing w:val="50"/>
-                <w:sz w:val="14"/>
-                <w:szCs w:val="14"/>
-              </w:rPr>
-              <w:t xml:space="preserve">Cantidad de tarimas</w:t>
-            </w:r>
-          </w:p>
-          <w:p>
-            <w:pPr>
-              <w:spacing w:before="0" w:after="0"/>
-            </w:pPr>
-            <w:r>
-              <w:rPr>
-                <w:rFonts w:ascii="Segoe UI Semibold" w:hAnsi="Segoe UI Semibold" w:cs="Segoe UI Semibold"/>
-                <w:b/>
-                <w:bCs/>
-                <w:color w:val="0F2B46"/>
-                <w:sz w:val="20"/>
-                <w:szCs w:val="20"/>
-              </w:rPr>
-              <w:t xml:space="preserve">2</w:t>
-            </w:r>
-          </w:p>
-        </w:tc>
-        <w:tc>
-          <w:tcPr>
-            <w:tcW w:w="2960" w:type="dxa"/>
-            <w:tcBorders>
-              <w:bottom w:val="single" w:sz="8" w:space="0" w:color="0F2B46"/>
-              <w:right w:val="single" w:sz="4" w:space="0" w:color="D8DBE0"/>
-            </w:tcBorders>
-            <w:shd w:val="clear" w:color="auto" w:fill="F5F6F8"/>
-            <w:tcMar>
-              <w:top w:w="150" w:type="dxa"/>
-              <w:left w:w="200" w:type="dxa"/>
-              <w:bottom w:w="150" w:type="dxa"/>
-              <w:right w:w="200" w:type="dxa"/>
-            </w:tcMar>
-            <w:vAlign w:val="top"/>
-          </w:tcPr>
-          <w:p>
-            <w:pPr>
-              <w:spacing w:before="0" w:after="30"/>
-            </w:pPr>
-            <w:r>
-              <w:rPr>
-                <w:rFonts w:ascii="Segoe UI" w:hAnsi="Segoe UI" w:cs="Segoe UI"/>
-                <w:caps/>
-                <w:color w:val="9A9A94"/>
-                <w:spacing w:val="50"/>
-                <w:sz w:val="14"/>
-                <w:szCs w:val="14"/>
-              </w:rPr>
-              <w:t xml:space="preserve">Dimensiones por tarima</w:t>
-            </w:r>
-          </w:p>
-          <w:p>
-            <w:pPr>
-              <w:spacing w:before="0" w:after="0"/>
-            </w:pPr>
-            <w:r>
-              <w:rPr>
-                <w:rFonts w:ascii="Segoe UI Semibold" w:hAnsi="Segoe UI Semibold" w:cs="Segoe UI Semibold"/>
-                <w:b/>
-                <w:bCs/>
-                <w:color w:val="0F2B46"/>
-                <w:sz w:val="20"/>
-                <w:szCs w:val="20"/>
-              </w:rPr>
-              <w:t xml:space="preserve">1.20</w:t>
-            </w:r>
-            <w:r>
-              <w:rPr>
-                <w:rFonts w:ascii="Segoe UI" w:hAnsi="Segoe UI" w:cs="Segoe UI"/>
-                <w:color w:val="9A9A94"/>
-                <w:sz w:val="18"/>
-                <w:szCs w:val="18"/>
-              </w:rPr>
-              <w:t xml:space="preserve"> × </w:t>
-            </w:r>
-            <w:r>
-              <w:rPr>
-                <w:rFonts w:ascii="Segoe UI Semibold" w:hAnsi="Segoe UI Semibold" w:cs="Segoe UI Semibold"/>
-                <w:b/>
-                <w:bCs/>
-                <w:color w:val="0F2B46"/>
-                <w:sz w:val="20"/>
-                <w:szCs w:val="20"/>
-              </w:rPr>
-              <w:t xml:space="preserve">1.00</w:t>
-            </w:r>
-            <w:r>
-              <w:rPr>
-                <w:rFonts w:ascii="Segoe UI" w:hAnsi="Segoe UI" w:cs="Segoe UI"/>
-                <w:color w:val="9A9A94"/>
-                <w:sz w:val="18"/>
-                <w:szCs w:val="18"/>
-              </w:rPr>
-              <w:t xml:space="preserve"> × </w:t>
-            </w:r>
-            <w:r>
-              <w:rPr>
-                <w:rFonts w:ascii="Segoe UI Semibold" w:hAnsi="Segoe UI Semibold" w:cs="Segoe UI Semibold"/>
-                <w:b/>
-                <w:bCs/>
-                <w:color w:val="0F2B46"/>
-                <w:sz w:val="20"/>
-                <w:szCs w:val="20"/>
-              </w:rPr>
-              <w:t xml:space="preserve">1.50</w:t>
-            </w:r>
-            <w:r>
-              <w:rPr>
-                <w:rFonts w:ascii="Segoe UI" w:hAnsi="Segoe UI" w:cs="Segoe UI"/>
-                <w:color w:val="6E6E68"/>
-                <w:sz w:val="17"/>
-                <w:szCs w:val="17"/>
-              </w:rPr>
-              <w:t xml:space="preserve"> m</w:t>
-            </w:r>
-          </w:p>
-        </w:tc>
-        <w:tc>
-          <w:tcPr>
-            <w:tcW w:w="2280" w:type="dxa"/>
-            <w:tcBorders>
-              <w:bottom w:val="single" w:sz="8" w:space="0" w:color="0F2B46"/>
-              <w:right w:val="single" w:sz="4" w:space="0" w:color="D8DBE0"/>
-            </w:tcBorders>
-            <w:shd w:val="clear" w:color="auto" w:fill="F5F6F8"/>
-            <w:tcMar>
-              <w:top w:w="150" w:type="dxa"/>
-              <w:left w:w="200" w:type="dxa"/>
-              <w:bottom w:w="150" w:type="dxa"/>
-              <w:right w:w="200" w:type="dxa"/>
-            </w:tcMar>
-            <w:vAlign w:val="top"/>
-          </w:tcPr>
-          <w:p>
-            <w:pPr>
-              <w:spacing w:before="0" w:after="30"/>
-            </w:pPr>
-            <w:r>
-              <w:rPr>
-                <w:rFonts w:ascii="Segoe UI" w:hAnsi="Segoe UI" w:cs="Segoe UI"/>
-                <w:caps/>
-                <w:color w:val="9A9A94"/>
-                <w:spacing w:val="50"/>
-                <w:sz w:val="14"/>
-                <w:szCs w:val="14"/>
-              </w:rPr>
-              <w:t xml:space="preserve">Peso aproximado</w:t>
-            </w:r>
-          </w:p>
-          <w:p>
-            <w:pPr>
-              <w:spacing w:before="0" w:after="0"/>
-            </w:pPr>
-            <w:r>
-              <w:rPr>
-                <w:rFonts w:ascii="Segoe UI Semibold" w:hAnsi="Segoe UI Semibold" w:cs="Segoe UI Semibold"/>
-                <w:b/>
-                <w:bCs/>
-                <w:color w:val="0F2B46"/>
-                <w:sz w:val="20"/>
-                <w:szCs w:val="20"/>
-              </w:rPr>
-              <w:t xml:space="preserve">2,000</w:t>
-            </w:r>
-            <w:r>
-              <w:rPr>
-                <w:rFonts w:ascii="Segoe UI" w:hAnsi="Segoe UI" w:cs="Segoe UI"/>
-                <w:color w:val="6E6E68"/>
-                <w:sz w:val="17"/>
-                <w:szCs w:val="17"/>
-              </w:rPr>
-              <w:t xml:space="preserve"> kg</w:t>
-            </w:r>
-          </w:p>
-        </w:tc>
-        <w:tc>
-          <w:tcPr>
-            <w:tcW w:w="2660" w:type="dxa"/>
-            <w:tcBorders>
-              <w:bottom w:val="single" w:sz="8" w:space="0" w:color="0F2B46"/>
-            </w:tcBorders>
-            <w:shd w:val="clear" w:color="auto" w:fill="F5F6F8"/>
-            <w:tcMar>
-              <w:top w:w="150" w:type="dxa"/>
-              <w:left w:w="200" w:type="dxa"/>
-              <w:bottom w:w="150" w:type="dxa"/>
-              <w:right w:w="200" w:type="dxa"/>
-            </w:tcMar>
-            <w:vAlign w:val="top"/>
-          </w:tcPr>
-          <w:p>
-            <w:pPr>
-              <w:spacing w:before="0" w:after="30"/>
-            </w:pPr>
-            <w:r>
-              <w:rPr>
-                <w:rFonts w:ascii="Segoe UI" w:hAnsi="Segoe UI" w:cs="Segoe UI"/>
-                <w:caps/>
-                <w:color w:val="9A9A94"/>
-                <w:spacing w:val="50"/>
-                <w:sz w:val="14"/>
-                <w:szCs w:val="14"/>
-              </w:rPr>
-              <w:t xml:space="preserve">Valor declarado</w:t>
-            </w:r>
-          </w:p>
-          <w:p>
-            <w:pPr>
-              <w:spacing w:before="0" w:after="0"/>
-            </w:pPr>
-            <w:r>
-              <w:rPr>
-                <w:rFonts w:ascii="Segoe UI" w:hAnsi="Segoe UI" w:cs="Segoe UI"/>
-                <w:color w:val="6E6E68"/>
-                <w:sz w:val="17"/>
-                <w:szCs w:val="17"/>
-              </w:rPr>
-              <w:t xml:space="preserve">$ </w:t>
-            </w:r>
-            <w:r>
-              <w:rPr>
-                <w:rFonts w:ascii="Segoe UI Semibold" w:hAnsi="Segoe UI Semibold" w:cs="Segoe UI Semibold"/>
-                <w:b/>
-                <w:bCs/>
-                <w:color w:val="0F2B46"/>
-                <w:sz w:val="20"/>
-                <w:szCs w:val="20"/>
-              </w:rPr>
-              <w:t xml:space="preserve">250,000.00</w:t>
-            </w:r>
-          </w:p>
-        </w:tc>
-      </w:tr>
-    </w:tbl>
-    <w:p>
-      <w:pPr>
-        <w:keepNext/>
-        <w:pBdr>
-          <w:left w:val="single" w:sz="16" w:space="7" w:color="B4975A"/>
-          <w:bottom w:val="single" w:sz="4" w:space="7" w:color="D8DBE0"/>
-        </w:pBdr>
-        <w:spacing w:before="340" w:after="160"/>
+        <w:spacing w:before="280" w:after="130"/>
         <w:ind w:left="190"/>
       </w:pPr>
       <w:r>
@@ -1232,7 +271,7 @@
       <w:tr>
         <w:trPr>
           <w:cantSplit/>
-          <w:trHeight w:val="620" w:hRule="atLeast"/>
+          <w:trHeight w:val="540" w:hRule="atLeast"/>
           <w:tblHeader/>
         </w:trPr>
         <w:tc>
@@ -1271,9 +310,9 @@
             <w:tcW w:w="3000" w:type="dxa"/>
             <w:shd w:val="clear" w:color="auto" w:fill="0F2B46"/>
             <w:tcMar>
-              <w:top w:w="140" w:type="dxa"/>
+              <w:top w:w="120" w:type="dxa"/>
               <w:left w:w="220" w:type="dxa"/>
-              <w:bottom w:w="140" w:type="dxa"/>
+              <w:bottom w:w="120" w:type="dxa"/>
               <w:right w:w="220" w:type="dxa"/>
             </w:tcMar>
             <w:vAlign w:val="center"/>
@@ -1302,7 +341,7 @@
       <w:tr>
         <w:trPr>
           <w:cantSplit/>
-          <w:trHeight w:val="560" w:hRule="atLeast"/>
+          <w:trHeight w:val="480" w:hRule="atLeast"/>
         </w:trPr>
         <w:tc>
           <w:tcPr>
@@ -1342,9 +381,9 @@
             </w:tcBorders>
             <w:shd w:val="clear" w:color="auto" w:fill="FFFFFF"/>
             <w:tcMar>
-              <w:top w:w="130" w:type="dxa"/>
+              <w:top w:w="110" w:type="dxa"/>
               <w:left w:w="220" w:type="dxa"/>
-              <w:bottom w:w="130" w:type="dxa"/>
+              <w:bottom w:w="110" w:type="dxa"/>
               <w:right w:w="220" w:type="dxa"/>
             </w:tcMar>
             <w:vAlign w:val="center"/>
@@ -1371,7 +410,7 @@
       <w:tr>
         <w:trPr>
           <w:cantSplit/>
-          <w:trHeight w:val="560" w:hRule="atLeast"/>
+          <w:trHeight w:val="480" w:hRule="atLeast"/>
         </w:trPr>
         <w:tc>
           <w:tcPr>
@@ -1411,9 +450,9 @@
             </w:tcBorders>
             <w:shd w:val="clear" w:color="auto" w:fill="F5F6F8"/>
             <w:tcMar>
-              <w:top w:w="130" w:type="dxa"/>
+              <w:top w:w="110" w:type="dxa"/>
               <w:left w:w="220" w:type="dxa"/>
-              <w:bottom w:w="130" w:type="dxa"/>
+              <w:bottom w:w="110" w:type="dxa"/>
               <w:right w:w="220" w:type="dxa"/>
             </w:tcMar>
             <w:vAlign w:val="center"/>
@@ -1440,7 +479,7 @@
       <w:tr>
         <w:trPr>
           <w:cantSplit/>
-          <w:trHeight w:val="560" w:hRule="atLeast"/>
+          <w:trHeight w:val="480" w:hRule="atLeast"/>
         </w:trPr>
         <w:tc>
           <w:tcPr>
@@ -1480,9 +519,9 @@
             </w:tcBorders>
             <w:shd w:val="clear" w:color="auto" w:fill="FFFFFF"/>
             <w:tcMar>
-              <w:top w:w="130" w:type="dxa"/>
+              <w:top w:w="110" w:type="dxa"/>
               <w:left w:w="220" w:type="dxa"/>
-              <w:bottom w:w="130" w:type="dxa"/>
+              <w:bottom w:w="110" w:type="dxa"/>
               <w:right w:w="220" w:type="dxa"/>
             </w:tcMar>
             <w:vAlign w:val="center"/>
@@ -1509,7 +548,7 @@
       <w:tr>
         <w:trPr>
           <w:cantSplit/>
-          <w:trHeight w:val="800" w:hRule="atLeast"/>
+          <w:trHeight w:val="700" w:hRule="atLeast"/>
         </w:trPr>
         <w:tc>
           <w:tcPr>
@@ -1519,9 +558,9 @@
             </w:tcBorders>
             <w:shd w:val="clear" w:color="auto" w:fill="0F2B46"/>
             <w:tcMar>
-              <w:top w:w="180" w:type="dxa"/>
+              <w:top w:w="150" w:type="dxa"/>
               <w:left w:w="220" w:type="dxa"/>
-              <w:bottom w:w="180" w:type="dxa"/>
+              <w:bottom w:w="150" w:type="dxa"/>
               <w:right w:w="220" w:type="dxa"/>
             </w:tcMar>
             <w:vAlign w:val="center"/>
@@ -1553,9 +592,9 @@
             </w:tcBorders>
             <w:shd w:val="clear" w:color="auto" w:fill="0F2B46"/>
             <w:tcMar>
-              <w:top w:w="180" w:type="dxa"/>
+              <w:top w:w="150" w:type="dxa"/>
               <w:left w:w="220" w:type="dxa"/>
-              <w:bottom w:w="180" w:type="dxa"/>
+              <w:bottom w:w="150" w:type="dxa"/>
               <w:right w:w="220" w:type="dxa"/>
             </w:tcMar>
             <w:vAlign w:val="center"/>
@@ -1582,28 +621,12 @@
     </w:tbl>
     <w:p>
       <w:pPr>
-        <w:spacing w:before="110" w:after="0"/>
-      </w:pPr>
-      <w:r>
-        <w:rPr>
-          <w:rFonts w:ascii="Segoe UI" w:hAnsi="Segoe UI" w:cs="Segoe UI"/>
-          <w:i/>
-          <w:iCs/>
-          <w:color w:val="6E6E68"/>
-          <w:sz w:val="15"/>
-          <w:szCs w:val="15"/>
-        </w:rPr>
-        <w:t xml:space="preserve">Importes expresados en pesos mexicanos (MXN). Los precios indicados no incluyen IVA.</w:t>
-      </w:r>
-    </w:p>
-    <w:p>
-      <w:pPr>
         <w:keepNext/>
         <w:pBdr>
           <w:left w:val="single" w:sz="16" w:space="7" w:color="B4975A"/>
           <w:bottom w:val="single" w:sz="4" w:space="7" w:color="D8DBE0"/>
         </w:pBdr>
-        <w:spacing w:before="340" w:after="160"/>
+        <w:spacing w:before="280" w:after="130"/>
         <w:ind w:left="190"/>
       </w:pPr>
       <w:r>
@@ -1626,7 +649,7 @@
           <w:ilvl w:val="0"/>
           <w:numId w:val="1"/>
         </w:numPr>
-        <w:spacing w:before="0" w:after="70" w:line="250" w:lineRule="auto"/>
+        <w:spacing w:before="0" w:after="60" w:line="232" w:lineRule="auto"/>
         <w:ind w:left="420" w:hanging="420"/>
         <w:contextualSpacing/>
         <w:jc w:val="both"/>
@@ -1635,8 +658,8 @@
         <w:rPr>
           <w:rFonts w:ascii="Segoe UI" w:hAnsi="Segoe UI" w:cs="Segoe UI"/>
           <w:color w:val="33383D"/>
-          <w:sz w:val="17"/>
-          <w:szCs w:val="17"/>
+          <w:sz w:val="16"/>
+          <w:szCs w:val="16"/>
         </w:rPr>
         <w:t xml:space="preserve">La presente cotización se emite con base en las características de la mercancía proporcionadas por el cliente.</w:t>
       </w:r>
@@ -1647,7 +670,7 @@
           <w:ilvl w:val="0"/>
           <w:numId w:val="1"/>
         </w:numPr>
-        <w:spacing w:before="0" w:after="70" w:line="250" w:lineRule="auto"/>
+        <w:spacing w:before="0" w:after="60" w:line="232" w:lineRule="auto"/>
         <w:ind w:left="420" w:hanging="420"/>
         <w:contextualSpacing/>
         <w:jc w:val="both"/>
@@ -1656,8 +679,8 @@
         <w:rPr>
           <w:rFonts w:ascii="Segoe UI" w:hAnsi="Segoe UI" w:cs="Segoe UI"/>
           <w:color w:val="33383D"/>
-          <w:sz w:val="17"/>
-          <w:szCs w:val="17"/>
+          <w:sz w:val="16"/>
+          <w:szCs w:val="16"/>
         </w:rPr>
         <w:t xml:space="preserve">Todos los importes indicados son más IVA.</w:t>
       </w:r>
@@ -1668,7 +691,7 @@
           <w:ilvl w:val="0"/>
           <w:numId w:val="1"/>
         </w:numPr>
-        <w:spacing w:before="0" w:after="70" w:line="250" w:lineRule="auto"/>
+        <w:spacing w:before="0" w:after="60" w:line="232" w:lineRule="auto"/>
         <w:ind w:left="420" w:hanging="420"/>
         <w:contextualSpacing/>
         <w:jc w:val="both"/>
@@ -1677,8 +700,8 @@
         <w:rPr>
           <w:rFonts w:ascii="Segoe UI" w:hAnsi="Segoe UI" w:cs="Segoe UI"/>
           <w:color w:val="33383D"/>
-          <w:sz w:val="17"/>
-          <w:szCs w:val="17"/>
+          <w:sz w:val="16"/>
+          <w:szCs w:val="16"/>
         </w:rPr>
         <w:t xml:space="preserve">Los precios están sujetos a validación del peso, dimensiones y condiciones reales de la mercancía al momento de la recolección.</w:t>
       </w:r>
@@ -1689,7 +712,7 @@
           <w:ilvl w:val="0"/>
           <w:numId w:val="1"/>
         </w:numPr>
-        <w:spacing w:before="0" w:after="70" w:line="250" w:lineRule="auto"/>
+        <w:spacing w:before="0" w:after="60" w:line="232" w:lineRule="auto"/>
         <w:ind w:left="420" w:hanging="420"/>
         <w:contextualSpacing/>
         <w:jc w:val="both"/>
@@ -1698,8 +721,8 @@
         <w:rPr>
           <w:rFonts w:ascii="Segoe UI" w:hAnsi="Segoe UI" w:cs="Segoe UI"/>
           <w:color w:val="33383D"/>
-          <w:sz w:val="17"/>
-          <w:szCs w:val="17"/>
+          <w:sz w:val="16"/>
+          <w:szCs w:val="16"/>
         </w:rPr>
         <w:t xml:space="preserve">El seguro de mercancía es opcional. En caso de requerir que el embarque viaje asegurado por Fletes Tauro, el costo será de $8.00 por cada millar del valor comercial declarado de la mercancía.</w:t>
       </w:r>
@@ -1710,7 +733,7 @@
           <w:ilvl w:val="0"/>
           <w:numId w:val="1"/>
         </w:numPr>
-        <w:spacing w:before="0" w:after="70" w:line="250" w:lineRule="auto"/>
+        <w:spacing w:before="0" w:after="60" w:line="232" w:lineRule="auto"/>
         <w:ind w:left="420" w:hanging="420"/>
         <w:contextualSpacing/>
         <w:jc w:val="both"/>
@@ -1719,8 +742,8 @@
         <w:rPr>
           <w:rFonts w:ascii="Segoe UI" w:hAnsi="Segoe UI" w:cs="Segoe UI"/>
           <w:color w:val="33383D"/>
-          <w:sz w:val="17"/>
-          <w:szCs w:val="17"/>
+          <w:sz w:val="16"/>
+          <w:szCs w:val="16"/>
         </w:rPr>
         <w:t xml:space="preserve">La cotización no incluye servicios adicionales como maniobras, almacenajes, reexpediciones, citas de entrega (las cuales deberán solicitarse con un mínimo de 48 horas de anticipación) ni cualquier otro concepto extraordinario que pudiera generarse durante la operación.</w:t>
       </w:r>
@@ -1731,7 +754,7 @@
           <w:ilvl w:val="0"/>
           <w:numId w:val="1"/>
         </w:numPr>
-        <w:spacing w:before="0" w:after="70" w:line="250" w:lineRule="auto"/>
+        <w:spacing w:before="0" w:after="60" w:line="232" w:lineRule="auto"/>
         <w:ind w:left="420" w:hanging="420"/>
         <w:contextualSpacing/>
         <w:jc w:val="both"/>
@@ -1740,135 +763,12 @@
         <w:rPr>
           <w:rFonts w:ascii="Segoe UI" w:hAnsi="Segoe UI" w:cs="Segoe UI"/>
           <w:color w:val="33383D"/>
-          <w:sz w:val="17"/>
-          <w:szCs w:val="17"/>
+          <w:sz w:val="16"/>
+          <w:szCs w:val="16"/>
         </w:rPr>
         <w:t xml:space="preserve">Para las recolecciones y entregas locales se utilizan unidades tipo rabón, mientras que el traslado entre Monterrey y Ciudad de México se realiza en tráiler con caja seca de 48 o 53 pies, de acuerdo con la disponibilidad operativa.</w:t>
       </w:r>
     </w:p>
-    <w:tbl>
-      <w:tblPr>
-        <w:tblW w:w="10080" w:type="dxa"/>
-        <w:tblLayout w:type="fixed"/>
-        <w:tblCellMar>
-          <w:top w:w="60" w:type="dxa"/>
-          <w:left w:w="100" w:type="dxa"/>
-          <w:bottom w:w="60" w:type="dxa"/>
-          <w:right w:w="100" w:type="dxa"/>
-        </w:tblCellMar>
-        <w:tblLook w:val="0000" w:firstRow="0" w:lastRow="0" w:firstColumn="0" w:lastColumn="0" w:noHBand="1" w:noVBand="1"/>
-      </w:tblPr>
-      <w:tblGrid>
-        <w:gridCol w:w="5600"/>
-        <w:gridCol w:w="4480"/>
-      </w:tblGrid>
-      <w:tr>
-        <w:trPr>
-          <w:cantSplit/>
-        </w:trPr>
-        <w:tc>
-          <w:tcPr>
-            <w:tcW w:w="5600" w:type="dxa"/>
-            <w:tcMar>
-              <w:top w:w="0" w:type="dxa"/>
-              <w:left w:w="0" w:type="dxa"/>
-              <w:bottom w:w="0" w:type="dxa"/>
-              <w:right w:w="260" w:type="dxa"/>
-            </w:tcMar>
-            <w:vAlign w:val="bottom"/>
-          </w:tcPr>
-          <w:p>
-            <w:pPr>
-              <w:spacing w:before="150" w:after="170"/>
-            </w:pPr>
-            <w:r>
-              <w:rPr>
-                <w:rFonts w:ascii="Segoe UI" w:hAnsi="Segoe UI" w:cs="Segoe UI"/>
-                <w:caps/>
-                <w:color w:val="9A9A94"/>
-                <w:spacing w:val="60"/>
-                <w:sz w:val="15"/>
-                <w:szCs w:val="15"/>
-              </w:rPr>
-              <w:t xml:space="preserve">Atentamente</w:t>
-            </w:r>
-          </w:p>
-          <w:p>
-            <w:pPr>
-              <w:pBdr>
-                <w:top w:val="single" w:sz="4" w:space="5" w:color="D8DBE0"/>
-              </w:pBdr>
-              <w:spacing w:before="0" w:after="0"/>
-            </w:pPr>
-            <w:r>
-              <w:rPr>
-                <w:rFonts w:ascii="Segoe UI Semibold" w:hAnsi="Segoe UI Semibold" w:cs="Segoe UI Semibold"/>
-                <w:b/>
-                <w:bCs/>
-                <w:color w:val="0F2B46"/>
-                <w:sz w:val="19"/>
-                <w:szCs w:val="19"/>
-              </w:rPr>
-              <w:t xml:space="preserve">Carlos Treviño</w:t>
-            </w:r>
-            <w:r>
-              <w:rPr>
-                <w:rFonts w:ascii="Segoe UI" w:hAnsi="Segoe UI" w:cs="Segoe UI"/>
-                <w:color w:val="6E6E68"/>
-                <w:sz w:val="16"/>
-                <w:szCs w:val="16"/>
-              </w:rPr>
-              <w:t xml:space="preserve">   ·   Ejecutivo de cuenta</w:t>
-            </w:r>
-          </w:p>
-        </w:tc>
-        <w:tc>
-          <w:tcPr>
-            <w:tcW w:w="4480" w:type="dxa"/>
-            <w:tcMar>
-              <w:top w:w="0" w:type="dxa"/>
-              <w:left w:w="260" w:type="dxa"/>
-              <w:bottom w:w="0" w:type="dxa"/>
-              <w:right w:w="0" w:type="dxa"/>
-            </w:tcMar>
-            <w:vAlign w:val="bottom"/>
-          </w:tcPr>
-          <w:p>
-            <w:pPr>
-              <w:spacing w:before="150" w:after="170"/>
-            </w:pPr>
-            <w:r>
-              <w:rPr>
-                <w:rFonts w:ascii="Segoe UI" w:hAnsi="Segoe UI" w:cs="Segoe UI"/>
-                <w:caps/>
-                <w:color w:val="9A9A94"/>
-                <w:spacing w:val="60"/>
-                <w:sz w:val="15"/>
-                <w:szCs w:val="15"/>
-              </w:rPr>
-              <w:t xml:space="preserve">Aceptación del cliente</w:t>
-            </w:r>
-          </w:p>
-          <w:p>
-            <w:pPr>
-              <w:pBdr>
-                <w:top w:val="single" w:sz="4" w:space="5" w:color="D8DBE0"/>
-              </w:pBdr>
-              <w:spacing w:before="0" w:after="0"/>
-            </w:pPr>
-            <w:r>
-              <w:rPr>
-                <w:rFonts w:ascii="Segoe UI" w:hAnsi="Segoe UI" w:cs="Segoe UI"/>
-                <w:color w:val="6E6E68"/>
-                <w:sz w:val="16"/>
-                <w:szCs w:val="16"/>
-              </w:rPr>
-              <w:t xml:space="preserve">Nombre y firma</w:t>
-            </w:r>
-          </w:p>
-        </w:tc>
-      </w:tr>
-    </w:tbl>
     <w:p>
       <w:pPr>
         <w:spacing w:before="0" w:after="0"/>
@@ -1887,7 +787,7 @@
       <w:footerReference w:type="default" r:id="rId7"/>
       <w:type w:val="nextPage"/>
       <w:pgSz w:w="12240" w:h="15840"/>
-      <w:pgMar w:top="1980" w:right="1080" w:bottom="1900" w:left="1080" w:header="620" w:footer="520" w:gutter="0"/>
+      <w:pgMar w:top="1820" w:right="1080" w:bottom="1780" w:left="1080" w:header="520" w:footer="440" w:gutter="0"/>
       <w:pgNumType w:start="1"/>
       <w:cols w:space="708"/>
       <w:docGrid w:linePitch="360"/>
@@ -2099,7 +999,7 @@
               <wp:inline distT="0" distB="0" distL="0" distR="0">
                 <wp:extent cx="566928" cy="578990"/>
                 <wp:effectExtent l="0" t="0" r="0" b="0"/>
-                <wp:docPr id="1130" name="Grupo Tauro"/>
+                <wp:docPr id="1096" name="Grupo Tauro"/>
                 <wp:cNvGraphicFramePr>
                   <a:graphicFrameLocks xmlns:a="http://schemas.openxmlformats.org/drawingml/2006/main" noChangeAspect="1"/>
                 </wp:cNvGraphicFramePr>
@@ -2107,7 +1007,7 @@
                   <a:graphicData uri="http://schemas.openxmlformats.org/drawingml/2006/picture">
                     <pic:pic xmlns:pic="http://schemas.openxmlformats.org/drawingml/2006/picture">
                       <pic:nvPicPr>
-                        <pic:cNvPr id="1131" name="Grupo Tauro"/>
+                        <pic:cNvPr id="1097" name="Grupo Tauro"/>
                         <pic:cNvPicPr/>
                       </pic:nvPicPr>
                       <pic:blipFill>
@@ -2149,7 +1049,7 @@
         </w:tcPr>
         <w:p>
           <w:pPr>
-            <w:spacing w:before="90" w:after="30"/>
+            <w:spacing w:before="70" w:after="25"/>
           </w:pPr>
           <w:r>
             <w:rPr>
@@ -2167,28 +1067,28 @@
         </w:p>
         <w:p>
           <w:pPr>
-            <w:spacing w:before="0" w:after="8"/>
+            <w:spacing w:before="0" w:after="6"/>
           </w:pPr>
           <w:r>
             <w:rPr>
               <w:rFonts w:ascii="Segoe UI" w:hAnsi="Segoe UI" w:cs="Segoe UI"/>
               <w:color w:val="6E6E68"/>
-              <w:sz w:val="13"/>
-              <w:szCs w:val="13"/>
+              <w:sz w:val="12"/>
+              <w:szCs w:val="12"/>
             </w:rPr>
             <w:t xml:space="preserve">Carretera a Laredo Km. 16.5 No. 16501 · Col. Moisés Sáenz</w:t>
           </w:r>
         </w:p>
         <w:p>
           <w:pPr>
-            <w:spacing w:before="0" w:after="8"/>
+            <w:spacing w:before="0" w:after="6"/>
           </w:pPr>
           <w:r>
             <w:rPr>
               <w:rFonts w:ascii="Segoe UI" w:hAnsi="Segoe UI" w:cs="Segoe UI"/>
               <w:color w:val="6E6E68"/>
-              <w:sz w:val="13"/>
-              <w:szCs w:val="13"/>
+              <w:sz w:val="12"/>
+              <w:szCs w:val="12"/>
             </w:rPr>
             <w:t xml:space="preserve">Apodaca, N.L., C.P. 66613 · Tel.: (81) 1958-0740</w:t>
           </w:r>
@@ -2210,7 +1110,7 @@
         </w:tcPr>
         <w:p>
           <w:pPr>
-            <w:spacing w:before="90" w:after="30"/>
+            <w:spacing w:before="70" w:after="25"/>
           </w:pPr>
           <w:r>
             <w:rPr>
@@ -2228,28 +1128,28 @@
         </w:p>
         <w:p>
           <w:pPr>
-            <w:spacing w:before="0" w:after="8"/>
+            <w:spacing w:before="0" w:after="6"/>
           </w:pPr>
           <w:r>
             <w:rPr>
               <w:rFonts w:ascii="Segoe UI" w:hAnsi="Segoe UI" w:cs="Segoe UI"/>
               <w:color w:val="6E6E68"/>
-              <w:sz w:val="13"/>
-              <w:szCs w:val="13"/>
+              <w:sz w:val="12"/>
+              <w:szCs w:val="12"/>
             </w:rPr>
             <w:t xml:space="preserve">Álamo No. 28 / Av. Ceylán Esq. Encino · Col. Tabla Honda</w:t>
           </w:r>
         </w:p>
         <w:p>
           <w:pPr>
-            <w:spacing w:before="0" w:after="8"/>
+            <w:spacing w:before="0" w:after="6"/>
           </w:pPr>
           <w:r>
             <w:rPr>
               <w:rFonts w:ascii="Segoe UI" w:hAnsi="Segoe UI" w:cs="Segoe UI"/>
               <w:color w:val="6E6E68"/>
-              <w:sz w:val="13"/>
-              <w:szCs w:val="13"/>
+              <w:sz w:val="12"/>
+              <w:szCs w:val="12"/>
             </w:rPr>
             <w:t xml:space="preserve">Tlalnepantla, Edo. de México · Tel.: (55) 5308-7500</w:t>
           </w:r>
@@ -2654,7 +1554,7 @@
     <w:tr>
       <w:trPr>
         <w:cantSplit/>
-        <w:trHeight w:val="1060" w:hRule="atLeast"/>
+        <w:trHeight w:val="940" w:hRule="atLeast"/>
       </w:trPr>
       <w:tc>
         <w:tcPr>
@@ -2674,9 +1574,9 @@
           <w:r>
             <w:drawing>
               <wp:inline distT="0" distB="0" distL="0" distR="0">
-                <wp:extent cx="1261872" cy="974076"/>
+                <wp:extent cx="1078992" cy="832906"/>
                 <wp:effectExtent l="0" t="0" r="0" b="0"/>
-                <wp:docPr id="1129" name="Fletes Tauro"/>
+                <wp:docPr id="1095" name="Fletes Tauro"/>
                 <wp:cNvGraphicFramePr>
                   <a:graphicFrameLocks xmlns:a="http://schemas.openxmlformats.org/drawingml/2006/main" noChangeAspect="1"/>
                 </wp:cNvGraphicFramePr>
@@ -2684,7 +1584,7 @@
                   <a:graphicData uri="http://schemas.openxmlformats.org/drawingml/2006/picture">
                     <pic:pic xmlns:pic="http://schemas.openxmlformats.org/drawingml/2006/picture">
                       <pic:nvPicPr>
-                        <pic:cNvPr id="1130" name="Fletes Tauro"/>
+                        <pic:cNvPr id="1096" name="Fletes Tauro"/>
                         <pic:cNvPicPr/>
                       </pic:nvPicPr>
                       <pic:blipFill>
@@ -2696,7 +1596,7 @@
                       <pic:spPr>
                         <a:xfrm>
                           <a:off x="0" y="0"/>
-                          <a:ext cx="1261872" cy="974076"/>
+                          <a:ext cx="1078992" cy="832906"/>
                         </a:xfrm>
                         <a:prstGeom prst="rect">
                           <a:avLst/>

</xml_diff>